<commit_message>
Restringir gastos a plan premium por sede
</commit_message>
<xml_diff>
--- a/docs/entrega-backend-gastos-balance-front.docx
+++ b/docs/entrega-backend-gastos-balance-front.docx
@@ -13,7 +13,7 @@
           <w:color w:val="000000"/>
           <w:sz w:val="44"/>
         </w:rPr>
-        <w:t>Entrega Backend: Gastos Diarios Integrados al Balance</w:t>
+        <w:t>Entrega Backend: Gastos Diarios Integrados al Balance Premium por Sede</w:t>
       </w:r>
     </w:p>
     <w:p>
@@ -52,6 +52,18 @@
           <w:sz w:val="21"/>
         </w:rPr>
         <w:t>Se implementó en backend el manejo de gastos diarios para que el balance de ventas refleje también los egresos de caja del día y permita que el cuadre de caja coincida con el dinero real disponible.</w:t>
+      </w:r>
+    </w:p>
+    <w:p>
+      <w:pPr>
+        <w:spacing w:after="120"/>
+      </w:pPr>
+      <w:r>
+        <w:rPr>
+          <w:rFonts w:ascii="Arial" w:hAnsi="Arial"/>
+          <w:sz w:val="21"/>
+        </w:rPr>
+        <w:t>Adicionalmente, esta funcionalidad quedó restringida a un plan premium por sede dentro de la plataforma.</w:t>
       </w:r>
     </w:p>
     <w:p>
@@ -133,6 +145,97 @@
     </w:p>
     <w:p>
       <w:pPr>
+        <w:spacing w:after="120"/>
+      </w:pPr>
+      <w:r>
+        <w:rPr>
+          <w:rFonts w:ascii="Arial" w:hAnsi="Arial"/>
+          <w:sz w:val="21"/>
+        </w:rPr>
+        <w:t>El módulo de gastos sólo está habilitado para sedes con plan PREMIUM activo y al día.</w:t>
+      </w:r>
+    </w:p>
+    <w:p>
+      <w:pPr>
+        <w:pStyle w:val="Heading1"/>
+      </w:pPr>
+      <w:r>
+        <w:rPr>
+          <w:rFonts w:ascii="Arial" w:hAnsi="Arial"/>
+          <w:b/>
+          <w:color w:val="193D7A"/>
+          <w:sz w:val="30"/>
+        </w:rPr>
+        <w:t>Regla Comercial Nueva</w:t>
+      </w:r>
+    </w:p>
+    <w:p>
+      <w:pPr>
+        <w:pStyle w:val="ListBullet"/>
+        <w:spacing w:after="40"/>
+      </w:pPr>
+      <w:r>
+        <w:rPr>
+          <w:rFonts w:ascii="Arial" w:hAnsi="Arial"/>
+          <w:sz w:val="21"/>
+        </w:rPr>
+        <w:t>La suscripción se maneja por sede.</w:t>
+      </w:r>
+    </w:p>
+    <w:p>
+      <w:pPr>
+        <w:pStyle w:val="ListBullet"/>
+        <w:spacing w:after="40"/>
+      </w:pPr>
+      <w:r>
+        <w:rPr>
+          <w:rFonts w:ascii="Arial" w:hAnsi="Arial"/>
+          <w:sz w:val="21"/>
+        </w:rPr>
+        <w:t>Cada sede ahora puede tener plan BASICO o PREMIUM.</w:t>
+      </w:r>
+    </w:p>
+    <w:p>
+      <w:pPr>
+        <w:pStyle w:val="ListBullet"/>
+        <w:spacing w:after="40"/>
+      </w:pPr>
+      <w:r>
+        <w:rPr>
+          <w:rFonts w:ascii="Arial" w:hAnsi="Arial"/>
+          <w:sz w:val="21"/>
+        </w:rPr>
+        <w:t>El módulo de gastos sólo puede usarse si la sede tiene suscripción configurada.</w:t>
+      </w:r>
+    </w:p>
+    <w:p>
+      <w:pPr>
+        <w:pStyle w:val="ListBullet"/>
+        <w:spacing w:after="40"/>
+      </w:pPr>
+      <w:r>
+        <w:rPr>
+          <w:rFonts w:ascii="Arial" w:hAnsi="Arial"/>
+          <w:sz w:val="21"/>
+        </w:rPr>
+        <w:t>La sede debe estar activa y no vencida.</w:t>
+      </w:r>
+    </w:p>
+    <w:p>
+      <w:pPr>
+        <w:pStyle w:val="ListBullet"/>
+        <w:spacing w:after="40"/>
+      </w:pPr>
+      <w:r>
+        <w:rPr>
+          <w:rFonts w:ascii="Arial" w:hAnsi="Arial"/>
+          <w:sz w:val="21"/>
+        </w:rPr>
+        <w:t>La sede debe tener plan PREMIUM para usar gastos.</w:t>
+      </w:r>
+    </w:p>
+    <w:p>
+      <w:pPr>
         <w:pStyle w:val="Heading1"/>
       </w:pPr>
       <w:r>
@@ -182,6 +285,32 @@
           <w:sz w:val="21"/>
         </w:rPr>
         <w:t>Campos: id, sedeId, administradorId, descripcion, valor, fecha, modoPago</w:t>
+      </w:r>
+    </w:p>
+    <w:p>
+      <w:pPr>
+        <w:pStyle w:val="ListBullet"/>
+        <w:spacing w:after="40"/>
+      </w:pPr>
+      <w:r>
+        <w:rPr>
+          <w:rFonts w:ascii="Arial" w:hAnsi="Arial"/>
+          <w:sz w:val="21"/>
+        </w:rPr>
+        <w:t>Nuevo campo de suscripción por sede: plan</w:t>
+      </w:r>
+    </w:p>
+    <w:p>
+      <w:pPr>
+        <w:pStyle w:val="ListBullet"/>
+        <w:spacing w:after="40"/>
+      </w:pPr>
+      <w:r>
+        <w:rPr>
+          <w:rFonts w:ascii="Arial" w:hAnsi="Arial"/>
+          <w:sz w:val="21"/>
+        </w:rPr>
+        <w:t>Valores posibles del plan: BASICO y PREMIUM</w:t>
       </w:r>
     </w:p>
     <w:p>
@@ -398,6 +527,19 @@
     </w:p>
     <w:p>
       <w:pPr>
+        <w:pStyle w:val="ListBullet"/>
+        <w:spacing w:after="40"/>
+      </w:pPr>
+      <w:r>
+        <w:rPr>
+          <w:rFonts w:ascii="Arial" w:hAnsi="Arial"/>
+          <w:sz w:val="21"/>
+        </w:rPr>
+        <w:t>La sede debe tener plan PREMIUM activo y vigente.</w:t>
+      </w:r>
+    </w:p>
+    <w:p>
+      <w:pPr>
         <w:spacing w:after="120"/>
       </w:pPr>
       <w:r>
@@ -529,6 +671,73 @@
                 <w:sz w:val="19"/>
               </w:rPr>
               <w:t xml:space="preserve">  }</w:t>
+              <w:br/>
+            </w:r>
+            <w:r>
+              <w:rPr>
+                <w:rFonts w:ascii="Consolas" w:hAnsi="Consolas"/>
+                <w:sz w:val="19"/>
+              </w:rPr>
+              <w:t>}</w:t>
+            </w:r>
+          </w:p>
+        </w:tc>
+      </w:tr>
+    </w:tbl>
+    <w:p/>
+    <w:p>
+      <w:pPr>
+        <w:spacing w:after="120"/>
+      </w:pPr>
+      <w:r>
+        <w:rPr>
+          <w:rFonts w:ascii="Arial" w:hAnsi="Arial"/>
+          <w:sz w:val="21"/>
+        </w:rPr>
+        <w:t>Error esperado si la sede no tiene premium:</w:t>
+      </w:r>
+    </w:p>
+    <w:tbl>
+      <w:tblPr>
+        <w:tblW w:type="auto" w:w="0"/>
+        <w:tblLayout w:type="fixed"/>
+        <w:tblLook w:firstColumn="1" w:firstRow="1" w:lastColumn="0" w:lastRow="0" w:noHBand="0" w:noVBand="1" w:val="04A0"/>
+      </w:tblPr>
+      <w:tblGrid>
+        <w:gridCol w:w="9072"/>
+      </w:tblGrid>
+      <w:tr>
+        <w:tc>
+          <w:tcPr>
+            <w:tcW w:type="dxa" w:w="9360"/>
+            <w:shd w:fill="F3F5F7"/>
+          </w:tcPr>
+          <w:p>
+            <w:pPr>
+              <w:spacing w:after="0"/>
+            </w:pPr>
+            <w:r>
+              <w:rPr>
+                <w:rFonts w:ascii="Consolas" w:hAnsi="Consolas"/>
+                <w:sz w:val="19"/>
+              </w:rPr>
+              <w:t>{</w:t>
+              <w:br/>
+            </w:r>
+            <w:r>
+              <w:rPr>
+                <w:rFonts w:ascii="Consolas" w:hAnsi="Consolas"/>
+                <w:sz w:val="19"/>
+              </w:rPr>
+              <w:t xml:space="preserve">  "error": true,</w:t>
+              <w:br/>
+            </w:r>
+            <w:r>
+              <w:rPr>
+                <w:rFonts w:ascii="Consolas" w:hAnsi="Consolas"/>
+                <w:sz w:val="19"/>
+              </w:rPr>
+              <w:t xml:space="preserve">  "respuesta": "La sede debe tener un plan PREMIUM activo para usar el modulo de gastos"</w:t>
               <w:br/>
             </w:r>
             <w:r>
@@ -695,6 +904,18 @@
           <w:sz w:val="21"/>
         </w:rPr>
         <w:t>Ambos endpoints ahora incluyen campos adicionales de gastos y caja.</w:t>
+      </w:r>
+    </w:p>
+    <w:p>
+      <w:pPr>
+        <w:spacing w:after="120"/>
+      </w:pPr>
+      <w:r>
+        <w:rPr>
+          <w:rFonts w:ascii="Arial" w:hAnsi="Arial"/>
+          <w:sz w:val="21"/>
+        </w:rPr>
+        <w:t>Los gastos sólo se reflejan para sedes con plan PREMIUM habilitado.</w:t>
       </w:r>
     </w:p>
     <w:p>
@@ -1012,6 +1233,174 @@
     </w:p>
     <w:p>
       <w:pPr>
+        <w:pStyle w:val="ListBullet"/>
+        <w:spacing w:after="40"/>
+      </w:pPr>
+      <w:r>
+        <w:rPr>
+          <w:rFonts w:ascii="Arial" w:hAnsi="Arial"/>
+          <w:sz w:val="21"/>
+        </w:rPr>
+        <w:t>Si la sede no tiene PREMIUM, el módulo de gastos queda deshabilitado.</w:t>
+      </w:r>
+    </w:p>
+    <w:p>
+      <w:pPr>
+        <w:pStyle w:val="Heading1"/>
+      </w:pPr>
+      <w:r>
+        <w:rPr>
+          <w:rFonts w:ascii="Arial" w:hAnsi="Arial"/>
+          <w:b/>
+          <w:color w:val="193D7A"/>
+          <w:sz w:val="30"/>
+        </w:rPr>
+        <w:t>Cambio en Suscripciones</w:t>
+      </w:r>
+    </w:p>
+    <w:p>
+      <w:pPr>
+        <w:spacing w:after="120"/>
+      </w:pPr>
+      <w:r>
+        <w:rPr>
+          <w:rFonts w:ascii="Arial" w:hAnsi="Arial"/>
+          <w:sz w:val="21"/>
+        </w:rPr>
+        <w:t>La configuración de suscripción por sede ahora debe incluir el plan.</w:t>
+      </w:r>
+    </w:p>
+    <w:tbl>
+      <w:tblPr>
+        <w:tblW w:type="auto" w:w="0"/>
+        <w:tblLayout w:type="fixed"/>
+        <w:tblLook w:firstColumn="1" w:firstRow="1" w:lastColumn="0" w:lastRow="0" w:noHBand="0" w:noVBand="1" w:val="04A0"/>
+      </w:tblPr>
+      <w:tblGrid>
+        <w:gridCol w:w="9072"/>
+      </w:tblGrid>
+      <w:tr>
+        <w:tc>
+          <w:tcPr>
+            <w:tcW w:type="dxa" w:w="9360"/>
+            <w:shd w:fill="F3F5F7"/>
+          </w:tcPr>
+          <w:p>
+            <w:pPr>
+              <w:spacing w:after="0"/>
+            </w:pPr>
+            <w:r>
+              <w:rPr>
+                <w:rFonts w:ascii="Consolas" w:hAnsi="Consolas"/>
+                <w:sz w:val="19"/>
+              </w:rPr>
+              <w:t>{</w:t>
+              <w:br/>
+            </w:r>
+            <w:r>
+              <w:rPr>
+                <w:rFonts w:ascii="Consolas" w:hAnsi="Consolas"/>
+                <w:sz w:val="19"/>
+              </w:rPr>
+              <w:t xml:space="preserve">  "sedeId": 1,</w:t>
+              <w:br/>
+            </w:r>
+            <w:r>
+              <w:rPr>
+                <w:rFonts w:ascii="Consolas" w:hAnsi="Consolas"/>
+                <w:sz w:val="19"/>
+              </w:rPr>
+              <w:t xml:space="preserve">  "plan": "PREMIUM",</w:t>
+              <w:br/>
+            </w:r>
+            <w:r>
+              <w:rPr>
+                <w:rFonts w:ascii="Consolas" w:hAnsi="Consolas"/>
+                <w:sz w:val="19"/>
+              </w:rPr>
+              <w:t xml:space="preserve">  "tipoCobro": "MENSUAL",</w:t>
+              <w:br/>
+            </w:r>
+            <w:r>
+              <w:rPr>
+                <w:rFonts w:ascii="Consolas" w:hAnsi="Consolas"/>
+                <w:sz w:val="19"/>
+              </w:rPr>
+              <w:t xml:space="preserve">  "precioMensual": 50000,</w:t>
+              <w:br/>
+            </w:r>
+            <w:r>
+              <w:rPr>
+                <w:rFonts w:ascii="Consolas" w:hAnsi="Consolas"/>
+                <w:sz w:val="19"/>
+              </w:rPr>
+              <w:t xml:space="preserve">  "precioAnual": 500000,</w:t>
+              <w:br/>
+            </w:r>
+            <w:r>
+              <w:rPr>
+                <w:rFonts w:ascii="Consolas" w:hAnsi="Consolas"/>
+                <w:sz w:val="19"/>
+              </w:rPr>
+              <w:t xml:space="preserve">  "fechaInicioServicio": "2026-06-02",</w:t>
+              <w:br/>
+            </w:r>
+            <w:r>
+              <w:rPr>
+                <w:rFonts w:ascii="Consolas" w:hAnsi="Consolas"/>
+                <w:sz w:val="19"/>
+              </w:rPr>
+              <w:t xml:space="preserve">  "observacion": "Plan premium con modulo de gastos",</w:t>
+              <w:br/>
+            </w:r>
+            <w:r>
+              <w:rPr>
+                <w:rFonts w:ascii="Consolas" w:hAnsi="Consolas"/>
+                <w:sz w:val="19"/>
+              </w:rPr>
+              <w:t xml:space="preserve">  "activa": true</w:t>
+              <w:br/>
+            </w:r>
+            <w:r>
+              <w:rPr>
+                <w:rFonts w:ascii="Consolas" w:hAnsi="Consolas"/>
+                <w:sz w:val="19"/>
+              </w:rPr>
+              <w:t>}</w:t>
+            </w:r>
+          </w:p>
+        </w:tc>
+      </w:tr>
+    </w:tbl>
+    <w:p/>
+    <w:p>
+      <w:pPr>
+        <w:pStyle w:val="ListBullet"/>
+        <w:spacing w:after="40"/>
+      </w:pPr>
+      <w:r>
+        <w:rPr>
+          <w:rFonts w:ascii="Arial" w:hAnsi="Arial"/>
+          <w:sz w:val="21"/>
+        </w:rPr>
+        <w:t>La respuesta de suscripción ahora incluye plan.</w:t>
+      </w:r>
+    </w:p>
+    <w:p>
+      <w:pPr>
+        <w:pStyle w:val="ListBullet"/>
+        <w:spacing w:after="40"/>
+      </w:pPr>
+      <w:r>
+        <w:rPr>
+          <w:rFonts w:ascii="Arial" w:hAnsi="Arial"/>
+          <w:sz w:val="21"/>
+        </w:rPr>
+        <w:t>La respuesta de suscripción ahora incluye gastosHabilitados.</w:t>
+      </w:r>
+    </w:p>
+    <w:p>
+      <w:pPr>
         <w:pStyle w:val="Heading1"/>
       </w:pPr>
       <w:r>
@@ -1113,6 +1502,32 @@
           <w:sz w:val="21"/>
         </w:rPr>
         <w:t>Refrescar balance e historial de gastos después de guardar.</w:t>
+      </w:r>
+    </w:p>
+    <w:p>
+      <w:pPr>
+        <w:pStyle w:val="ListBullet"/>
+        <w:spacing w:after="40"/>
+      </w:pPr>
+      <w:r>
+        <w:rPr>
+          <w:rFonts w:ascii="Arial" w:hAnsi="Arial"/>
+          <w:sz w:val="21"/>
+        </w:rPr>
+        <w:t>Validar antes de habilitar gastos si la sede tiene plan PREMIUM.</w:t>
+      </w:r>
+    </w:p>
+    <w:p>
+      <w:pPr>
+        <w:pStyle w:val="ListBullet"/>
+        <w:spacing w:after="40"/>
+      </w:pPr>
+      <w:r>
+        <w:rPr>
+          <w:rFonts w:ascii="Arial" w:hAnsi="Arial"/>
+          <w:sz w:val="21"/>
+        </w:rPr>
+        <w:t>Si no tiene PREMIUM, mostrar mensaje o CTA de mejora de plan.</w:t>
       </w:r>
     </w:p>
     <w:p>
@@ -1237,6 +1652,19 @@
           <w:rFonts w:ascii="Arial" w:hAnsi="Arial"/>
           <w:sz w:val="21"/>
         </w:rPr>
+        <w:t>Nuevo enum PlanSuscripcionSede.</w:t>
+      </w:r>
+    </w:p>
+    <w:p>
+      <w:pPr>
+        <w:pStyle w:val="ListBullet"/>
+        <w:spacing w:after="40"/>
+      </w:pPr>
+      <w:r>
+        <w:rPr>
+          <w:rFonts w:ascii="Arial" w:hAnsi="Arial"/>
+          <w:sz w:val="21"/>
+        </w:rPr>
         <w:t>Nuevo repositorio GastoDiarioRepository.</w:t>
       </w:r>
     </w:p>
@@ -1251,6 +1679,19 @@
           <w:sz w:val="21"/>
         </w:rPr>
         <w:t>Nuevo servicio GastoDiarioServicio.</w:t>
+      </w:r>
+    </w:p>
+    <w:p>
+      <w:pPr>
+        <w:pStyle w:val="ListBullet"/>
+        <w:spacing w:after="40"/>
+      </w:pPr>
+      <w:r>
+        <w:rPr>
+          <w:rFonts w:ascii="Arial" w:hAnsi="Arial"/>
+          <w:sz w:val="21"/>
+        </w:rPr>
+        <w:t>Nuevo servicio SuscripcionFeatureService.</w:t>
       </w:r>
     </w:p>
     <w:p>
@@ -1289,6 +1730,19 @@
           <w:rFonts w:ascii="Arial" w:hAnsi="Arial"/>
           <w:sz w:val="21"/>
         </w:rPr>
+        <w:t>Nuevo campo plan en suscripcion_sede.</w:t>
+      </w:r>
+    </w:p>
+    <w:p>
+      <w:pPr>
+        <w:pStyle w:val="ListBullet"/>
+        <w:spacing w:after="40"/>
+      </w:pPr>
+      <w:r>
+        <w:rPr>
+          <w:rFonts w:ascii="Arial" w:hAnsi="Arial"/>
+          <w:sz w:val="21"/>
+        </w:rPr>
         <w:t>Ajuste de BalanceGeneralDTO y BalanceSedeDTO.</w:t>
       </w:r>
     </w:p>
@@ -1303,6 +1757,19 @@
           <w:sz w:val="21"/>
         </w:rPr>
         <w:t>Ajuste de BalanceServicioImpl y BalanceController.</w:t>
+      </w:r>
+    </w:p>
+    <w:p>
+      <w:pPr>
+        <w:pStyle w:val="ListBullet"/>
+        <w:spacing w:after="40"/>
+      </w:pPr>
+      <w:r>
+        <w:rPr>
+          <w:rFonts w:ascii="Arial" w:hAnsi="Arial"/>
+          <w:sz w:val="21"/>
+        </w:rPr>
+        <w:t>Ajuste de DTOs de suscripción de sede.</w:t>
       </w:r>
     </w:p>
     <w:p>

</xml_diff>